<commit_message>
v1.1.56: to budskaber, ikke eet
  Din stemme bliver i europaeisk sky. Dine kunders lyd bliver hos dig.

De to halvdele traekker i hver sin retning, og det er meningen. Den ene er
et loefte om tilbageholdenhed, den anden om formaaen: bliver dikteringen
lige saa god som Wispr Flow OG koerer paa europaeisk AI, er der kommet
noget de faerreste har.

Sendes der noget videre fra et moede er det UDELUKKENDE transkriptionen.
Til et moede sidder der mennesker der ikke selv har valgt noget.

Loeftet staar 35 steder i dag. De er sande nu, fordi dikteringen ikke
findes, og de er derfor IKKE rettet paa forskud - en app der lover noget
den ikke goer er den samme fejl med omvendt fortegn. Hjemmesiden og
politikken er i stedet formuleret saa de holder: «lyden fra dine MOEDER»
frem for «lyden». Naar dikteringen lander skal der TILFOEJES et afsnit,
ikke rettes en usandhed.

Word-dokumenterne bygget om fra siderne.

Co-Authored-By: Claude Opus 5 <noreply@anthropic.com>
</commit_message>
<xml_diff>
--- a/Jura/HeyPia Privacy Policy.docx
+++ b/Jura/HeyPia Privacy Policy.docx
@@ -462,12 +462,26 @@
         <w:pStyle w:val="Overskrift3"/>
       </w:pPr>
       <w:r>
-        <w:t>The audio stays where it is</w:t>
-      </w:r>
-    </w:p>
-    <w:p>
-      <w:r>
-        <w:t>The recording is transcribed to text on your own machine. The audio file is never sent anywhere.</w:t>
+        <w:t>Meeting audio stays where it is</w:t>
+      </w:r>
+    </w:p>
+    <w:p>
+      <w:r>
+        <w:t xml:space="preserve">A meeting recording is transcribed to text on your own machine. The audio file is never sent anywhere, whatever other features you switch on. If anything from a meeting is sent onward, it is </w:t>
+      </w:r>
+      <w:r>
+        <w:rPr>
+          <w:b/>
+        </w:rPr>
+        <w:t>the transcript and nothing else</w:t>
+      </w:r>
+      <w:r>
+        <w:t>.</w:t>
+      </w:r>
+    </w:p>
+    <w:p>
+      <w:r>
+        <w:t>The reason is that a meeting has people in it who chose nothing themselves. Their voices are not ours to move.</w:t>
       </w:r>
     </w:p>
     <w:p>
@@ -1156,7 +1170,7 @@
     <w:link w:val="Overskrift1Tegn"/>
     <w:uiPriority w:val="9"/>
     <w:qFormat/>
-    <w:rsid w:val="00EB0FA9"/>
+    <w:rsid w:val="00DA6F59"/>
     <w:pPr>
       <w:keepNext/>
       <w:keepLines/>
@@ -1178,7 +1192,7 @@
     <w:uiPriority w:val="9"/>
     <w:unhideWhenUsed/>
     <w:qFormat/>
-    <w:rsid w:val="00EB0FA9"/>
+    <w:rsid w:val="00DA6F59"/>
     <w:pPr>
       <w:keepNext/>
       <w:keepLines/>
@@ -1200,7 +1214,7 @@
     <w:uiPriority w:val="9"/>
     <w:unhideWhenUsed/>
     <w:qFormat/>
-    <w:rsid w:val="00EB0FA9"/>
+    <w:rsid w:val="00DA6F59"/>
     <w:pPr>
       <w:keepNext/>
       <w:keepLines/>
@@ -1223,7 +1237,7 @@
     <w:semiHidden/>
     <w:unhideWhenUsed/>
     <w:qFormat/>
-    <w:rsid w:val="00EB0FA9"/>
+    <w:rsid w:val="00DA6F59"/>
     <w:pPr>
       <w:keepNext/>
       <w:keepLines/>
@@ -1246,7 +1260,7 @@
     <w:semiHidden/>
     <w:unhideWhenUsed/>
     <w:qFormat/>
-    <w:rsid w:val="00EB0FA9"/>
+    <w:rsid w:val="00DA6F59"/>
     <w:pPr>
       <w:keepNext/>
       <w:keepLines/>
@@ -1267,7 +1281,7 @@
     <w:semiHidden/>
     <w:unhideWhenUsed/>
     <w:qFormat/>
-    <w:rsid w:val="00EB0FA9"/>
+    <w:rsid w:val="00DA6F59"/>
     <w:pPr>
       <w:keepNext/>
       <w:keepLines/>
@@ -1290,7 +1304,7 @@
     <w:semiHidden/>
     <w:unhideWhenUsed/>
     <w:qFormat/>
-    <w:rsid w:val="00EB0FA9"/>
+    <w:rsid w:val="00DA6F59"/>
     <w:pPr>
       <w:keepNext/>
       <w:keepLines/>
@@ -1311,7 +1325,7 @@
     <w:semiHidden/>
     <w:unhideWhenUsed/>
     <w:qFormat/>
-    <w:rsid w:val="00EB0FA9"/>
+    <w:rsid w:val="00DA6F59"/>
     <w:pPr>
       <w:keepNext/>
       <w:keepLines/>
@@ -1334,7 +1348,7 @@
     <w:semiHidden/>
     <w:unhideWhenUsed/>
     <w:qFormat/>
-    <w:rsid w:val="00EB0FA9"/>
+    <w:rsid w:val="00DA6F59"/>
     <w:pPr>
       <w:keepNext/>
       <w:keepLines/>
@@ -1378,7 +1392,7 @@
     <w:basedOn w:val="Standardskrifttypeiafsnit"/>
     <w:link w:val="Overskrift1"/>
     <w:uiPriority w:val="9"/>
-    <w:rsid w:val="00EB0FA9"/>
+    <w:rsid w:val="00DA6F59"/>
     <w:rPr>
       <w:rFonts w:asciiTheme="majorHAnsi" w:eastAsiaTheme="majorEastAsia" w:hAnsiTheme="majorHAnsi" w:cstheme="majorBidi"/>
       <w:color w:val="0F4761" w:themeColor="accent1" w:themeShade="BF"/>
@@ -1391,7 +1405,7 @@
     <w:basedOn w:val="Standardskrifttypeiafsnit"/>
     <w:link w:val="Overskrift2"/>
     <w:uiPriority w:val="9"/>
-    <w:rsid w:val="00EB0FA9"/>
+    <w:rsid w:val="00DA6F59"/>
     <w:rPr>
       <w:rFonts w:asciiTheme="majorHAnsi" w:eastAsiaTheme="majorEastAsia" w:hAnsiTheme="majorHAnsi" w:cstheme="majorBidi"/>
       <w:color w:val="0F4761" w:themeColor="accent1" w:themeShade="BF"/>
@@ -1404,7 +1418,7 @@
     <w:basedOn w:val="Standardskrifttypeiafsnit"/>
     <w:link w:val="Overskrift3"/>
     <w:uiPriority w:val="9"/>
-    <w:rsid w:val="00EB0FA9"/>
+    <w:rsid w:val="00DA6F59"/>
     <w:rPr>
       <w:rFonts w:eastAsiaTheme="majorEastAsia" w:cstheme="majorBidi"/>
       <w:color w:val="0F4761" w:themeColor="accent1" w:themeShade="BF"/>
@@ -1418,7 +1432,7 @@
     <w:link w:val="Overskrift4"/>
     <w:uiPriority w:val="9"/>
     <w:semiHidden/>
-    <w:rsid w:val="00EB0FA9"/>
+    <w:rsid w:val="00DA6F59"/>
     <w:rPr>
       <w:rFonts w:eastAsiaTheme="majorEastAsia" w:cstheme="majorBidi"/>
       <w:i/>
@@ -1432,7 +1446,7 @@
     <w:link w:val="Overskrift5"/>
     <w:uiPriority w:val="9"/>
     <w:semiHidden/>
-    <w:rsid w:val="00EB0FA9"/>
+    <w:rsid w:val="00DA6F59"/>
     <w:rPr>
       <w:rFonts w:eastAsiaTheme="majorEastAsia" w:cstheme="majorBidi"/>
       <w:color w:val="0F4761" w:themeColor="accent1" w:themeShade="BF"/>
@@ -1444,7 +1458,7 @@
     <w:link w:val="Overskrift6"/>
     <w:uiPriority w:val="9"/>
     <w:semiHidden/>
-    <w:rsid w:val="00EB0FA9"/>
+    <w:rsid w:val="00DA6F59"/>
     <w:rPr>
       <w:rFonts w:eastAsiaTheme="majorEastAsia" w:cstheme="majorBidi"/>
       <w:i/>
@@ -1458,7 +1472,7 @@
     <w:link w:val="Overskrift7"/>
     <w:uiPriority w:val="9"/>
     <w:semiHidden/>
-    <w:rsid w:val="00EB0FA9"/>
+    <w:rsid w:val="00DA6F59"/>
     <w:rPr>
       <w:rFonts w:eastAsiaTheme="majorEastAsia" w:cstheme="majorBidi"/>
       <w:color w:val="595959" w:themeColor="text1" w:themeTint="A6"/>
@@ -1470,7 +1484,7 @@
     <w:link w:val="Overskrift8"/>
     <w:uiPriority w:val="9"/>
     <w:semiHidden/>
-    <w:rsid w:val="00EB0FA9"/>
+    <w:rsid w:val="00DA6F59"/>
     <w:rPr>
       <w:rFonts w:eastAsiaTheme="majorEastAsia" w:cstheme="majorBidi"/>
       <w:i/>
@@ -1484,7 +1498,7 @@
     <w:link w:val="Overskrift9"/>
     <w:uiPriority w:val="9"/>
     <w:semiHidden/>
-    <w:rsid w:val="00EB0FA9"/>
+    <w:rsid w:val="00DA6F59"/>
     <w:rPr>
       <w:rFonts w:eastAsiaTheme="majorEastAsia" w:cstheme="majorBidi"/>
       <w:color w:val="272727" w:themeColor="text1" w:themeTint="D8"/>
@@ -1497,7 +1511,7 @@
     <w:link w:val="TitelTegn"/>
     <w:uiPriority w:val="10"/>
     <w:qFormat/>
-    <w:rsid w:val="00EB0FA9"/>
+    <w:rsid w:val="00DA6F59"/>
     <w:pPr>
       <w:spacing w:after="80" w:line="240" w:lineRule="auto"/>
       <w:contextualSpacing/>
@@ -1515,7 +1529,7 @@
     <w:basedOn w:val="Standardskrifttypeiafsnit"/>
     <w:link w:val="Titel"/>
     <w:uiPriority w:val="10"/>
-    <w:rsid w:val="00EB0FA9"/>
+    <w:rsid w:val="00DA6F59"/>
     <w:rPr>
       <w:rFonts w:asciiTheme="majorHAnsi" w:eastAsiaTheme="majorEastAsia" w:hAnsiTheme="majorHAnsi" w:cstheme="majorBidi"/>
       <w:spacing w:val="-10"/>
@@ -1531,7 +1545,7 @@
     <w:link w:val="UndertitelTegn"/>
     <w:uiPriority w:val="11"/>
     <w:qFormat/>
-    <w:rsid w:val="00EB0FA9"/>
+    <w:rsid w:val="00DA6F59"/>
     <w:pPr>
       <w:numPr>
         <w:ilvl w:val="1"/>
@@ -1550,7 +1564,7 @@
     <w:basedOn w:val="Standardskrifttypeiafsnit"/>
     <w:link w:val="Undertitel"/>
     <w:uiPriority w:val="11"/>
-    <w:rsid w:val="00EB0FA9"/>
+    <w:rsid w:val="00DA6F59"/>
     <w:rPr>
       <w:rFonts w:eastAsiaTheme="majorEastAsia" w:cstheme="majorBidi"/>
       <w:color w:val="595959" w:themeColor="text1" w:themeTint="A6"/>
@@ -1566,7 +1580,7 @@
     <w:link w:val="CitatTegn"/>
     <w:uiPriority w:val="29"/>
     <w:qFormat/>
-    <w:rsid w:val="00EB0FA9"/>
+    <w:rsid w:val="00DA6F59"/>
     <w:pPr>
       <w:spacing w:before="160"/>
       <w:jc w:val="center"/>
@@ -1582,7 +1596,7 @@
     <w:basedOn w:val="Standardskrifttypeiafsnit"/>
     <w:link w:val="Citat"/>
     <w:uiPriority w:val="29"/>
-    <w:rsid w:val="00EB0FA9"/>
+    <w:rsid w:val="00DA6F59"/>
     <w:rPr>
       <w:i/>
       <w:iCs/>
@@ -1594,7 +1608,7 @@
     <w:basedOn w:val="Normal"/>
     <w:uiPriority w:val="34"/>
     <w:qFormat/>
-    <w:rsid w:val="00EB0FA9"/>
+    <w:rsid w:val="00DA6F59"/>
     <w:pPr>
       <w:ind w:left="720"/>
       <w:contextualSpacing/>
@@ -1605,7 +1619,7 @@
     <w:basedOn w:val="Standardskrifttypeiafsnit"/>
     <w:uiPriority w:val="21"/>
     <w:qFormat/>
-    <w:rsid w:val="00EB0FA9"/>
+    <w:rsid w:val="00DA6F59"/>
     <w:rPr>
       <w:i/>
       <w:iCs/>
@@ -1619,7 +1633,7 @@
     <w:link w:val="StrktcitatTegn"/>
     <w:uiPriority w:val="30"/>
     <w:qFormat/>
-    <w:rsid w:val="00EB0FA9"/>
+    <w:rsid w:val="00DA6F59"/>
     <w:pPr>
       <w:pBdr>
         <w:top w:val="single" w:sz="4" w:space="10" w:color="0F4761" w:themeColor="accent1" w:themeShade="BF"/>
@@ -1640,7 +1654,7 @@
     <w:basedOn w:val="Standardskrifttypeiafsnit"/>
     <w:link w:val="Strktcitat"/>
     <w:uiPriority w:val="30"/>
-    <w:rsid w:val="00EB0FA9"/>
+    <w:rsid w:val="00DA6F59"/>
     <w:rPr>
       <w:i/>
       <w:iCs/>
@@ -1652,7 +1666,7 @@
     <w:basedOn w:val="Standardskrifttypeiafsnit"/>
     <w:uiPriority w:val="32"/>
     <w:qFormat/>
-    <w:rsid w:val="00EB0FA9"/>
+    <w:rsid w:val="00DA6F59"/>
     <w:rPr>
       <w:b/>
       <w:bCs/>

</xml_diff>